<commit_message>
feat: replace fragmented date placeholders with full signing date and add specialized formatting for contract templates
</commit_message>
<xml_diff>
--- a/backend/app/seeds/data/fixed_term.docx
+++ b/backend/app/seeds/data/fixed_term.docx
@@ -1,6 +1,6 @@
 
 <file path=word/document.xml><?xml version="1.0" encoding="utf-8"?>
-<w:document xmlns:o="urn:schemas-microsoft-com:office:office" xmlns:r="http://schemas.openxmlformats.org/officeDocument/2006/relationships" xmlns:v="urn:schemas-microsoft-com:vml" xmlns:w="http://schemas.openxmlformats.org/wordprocessingml/2006/main" xmlns:w10="urn:schemas-microsoft-com:office:word" xmlns:wp="http://schemas.openxmlformats.org/drawingml/2006/wordprocessingDrawing" xmlns:pic="http://schemas.openxmlformats.org/drawingml/2006/picture" xmlns:wps="http://schemas.microsoft.com/office/word/2010/wordprocessingShape" xmlns:wpg="http://schemas.microsoft.com/office/word/2010/wordprocessingGroup" xmlns:mc="http://schemas.openxmlformats.org/markup-compatibility/2006" xmlns:wp14="http://schemas.microsoft.com/office/word/2010/wordprocessingDrawing" xmlns:w14="http://schemas.microsoft.com/office/word/2010/wordml" xmlns:w15="http://schemas.microsoft.com/office/word/2012/wordml" mc:Ignorable="w14 wp14 w15">
+<w:document xmlns:ns1="http://schemas.openxmlformats.org/markup-compatibility/2006" xmlns:ns2="http://schemas.openxmlformats.org/drawingml/2006/wordprocessingDrawing" xmlns:ns3="http://schemas.openxmlformats.org/drawingml/2006/main" xmlns:ns4="http://schemas.openxmlformats.org/drawingml/2006/picture" xmlns:ns5="http://schemas.openxmlformats.org/officeDocument/2006/relationships" xmlns:w="http://schemas.openxmlformats.org/wordprocessingml/2006/main" ns1:Ignorable="w14 wp14 w15">
   <w:body>
     <w:tbl>
       <w:tblPr>
@@ -103,42 +103,42 @@
             <w:r>
               <w:rPr/>
               <w:drawing>
-                <wp:inline distT="0" distB="0" distL="0" distR="0">
-                  <wp:extent cx="636270" cy="684530"/>
-                  <wp:effectExtent l="0" t="0" r="0" b="0"/>
-                  <wp:docPr id="1" name="Picture 3"/>
-                  <wp:cNvGraphicFramePr>
-                    <a:graphicFrameLocks xmlns:a="http://schemas.openxmlformats.org/drawingml/2006/main" noChangeAspect="1"/>
-                  </wp:cNvGraphicFramePr>
-                  <a:graphic xmlns:a="http://schemas.openxmlformats.org/drawingml/2006/main">
-                    <a:graphicData uri="http://schemas.openxmlformats.org/drawingml/2006/picture">
-                      <pic:pic xmlns:pic="http://schemas.openxmlformats.org/drawingml/2006/picture">
-                        <pic:nvPicPr>
-                          <pic:cNvPr id="1" name="Picture 3"/>
-                          <pic:cNvPicPr>
-                            <a:picLocks noChangeAspect="1" noChangeArrowheads="1"/>
-                          </pic:cNvPicPr>
-                        </pic:nvPicPr>
-                        <pic:blipFill>
-                          <a:blip r:embed="rId2"/>
-                          <a:stretch>
-                            <a:fillRect/>
-                          </a:stretch>
-                        </pic:blipFill>
-                        <pic:spPr bwMode="auto">
-                          <a:xfrm>
-                            <a:off x="0" y="0"/>
-                            <a:ext cx="636270" cy="684530"/>
-                          </a:xfrm>
-                          <a:prstGeom prst="rect">
-                            <a:avLst/>
-                          </a:prstGeom>
-                          <a:noFill/>
-                        </pic:spPr>
-                      </pic:pic>
-                    </a:graphicData>
-                  </a:graphic>
-                </wp:inline>
+                <ns2:inline distT="0" distB="0" distL="0" distR="0">
+                  <ns2:extent cx="636270" cy="684530"/>
+                  <ns2:effectExtent l="0" t="0" r="0" b="0"/>
+                  <ns2:docPr id="1" name="Picture 3"/>
+                  <ns2:cNvGraphicFramePr>
+                    <ns3:graphicFrameLocks noChangeAspect="1"/>
+                  </ns2:cNvGraphicFramePr>
+                  <ns3:graphic>
+                    <ns3:graphicData uri="http://schemas.openxmlformats.org/drawingml/2006/picture">
+                      <ns4:pic>
+                        <ns4:nvPicPr>
+                          <ns4:cNvPr id="1" name="Picture 3"/>
+                          <ns4:cNvPicPr>
+                            <ns3:picLocks noChangeAspect="1" noChangeArrowheads="1"/>
+                          </ns4:cNvPicPr>
+                        </ns4:nvPicPr>
+                        <ns4:blipFill>
+                          <ns3:blip ns5:embed="rId2"/>
+                          <ns3:stretch>
+                            <ns3:fillRect/>
+                          </ns3:stretch>
+                        </ns4:blipFill>
+                        <ns4:spPr bwMode="auto">
+                          <ns3:xfrm>
+                            <ns3:off x="0" y="0"/>
+                            <ns3:ext cx="636270" cy="684530"/>
+                          </ns3:xfrm>
+                          <ns3:prstGeom prst="rect">
+                            <ns3:avLst/>
+                          </ns3:prstGeom>
+                          <ns3:noFill/>
+                        </ns4:spPr>
+                      </ns4:pic>
+                    </ns3:graphicData>
+                  </ns3:graphic>
+                </ns2:inline>
               </w:drawing>
             </w:r>
           </w:p>
@@ -397,156 +397,7 @@
         </w:rPr>
       </w:pPr>
       <w:r>
-        <w:rPr>
-          <w:sz w:val="22"/>
-          <w:szCs w:val="22"/>
-          <w:lang w:val="vi-VN"/>
-        </w:rPr>
-        <w:t xml:space="preserve">Hôm nay ngày </w:t>
-      </w:r>
-      <w:r>
-        <w:rPr>
-          <w:sz w:val="22"/>
-          <w:szCs w:val="22"/>
-          <w:lang w:val="vi-VN"/>
-        </w:rPr>
-        <w:fldChar w:fldCharType="begin"/>
-      </w:r>
-      <w:r>
-        <w:rPr>
-          <w:sz w:val="22"/>
-          <w:szCs w:val="22"/>
-          <w:lang w:val="vi-VN"/>
-        </w:rPr>
-        <w:instrText xml:space="preserve"> MERGEFIELD Ngày </w:instrText>
-      </w:r>
-      <w:r>
-        <w:rPr>
-          <w:sz w:val="22"/>
-          <w:szCs w:val="22"/>
-          <w:lang w:val="vi-VN"/>
-        </w:rPr>
-        <w:fldChar w:fldCharType="separate"/>
-      </w:r>
-      <w:r>
-        <w:rPr>
-          <w:sz w:val="22"/>
-          <w:szCs w:val="22"/>
-          <w:lang w:val="vi-VN"/>
-        </w:rPr>
-      </w:r>
-      <w:r>
-        <w:rPr>
-          <w:sz w:val="22"/>
-          <w:szCs w:val="22"/>
-          <w:lang w:val="vi-VN"/>
-        </w:rPr>
-        <w:fldChar w:fldCharType="end"/>
-      </w:r>
-      <w:r>
-        <w:rPr>
-          <w:sz w:val="22"/>
-          <w:szCs w:val="22"/>
-          <w:lang w:val="vi-VN"/>
-        </w:rPr>
-        <w:t xml:space="preserve"> </w:t>
-      </w:r>
-      <w:r>
-        <w:rPr>
-          <w:sz w:val="22"/>
-          <w:szCs w:val="22"/>
-        </w:rPr>
-        <w:t xml:space="preserve">tháng </w:t>
-      </w:r>
-      <w:r>
-        <w:rPr>
-          <w:sz w:val="22"/>
-          <w:szCs w:val="22"/>
-        </w:rPr>
-        <w:fldChar w:fldCharType="begin"/>
-      </w:r>
-      <w:r>
-        <w:rPr>
-          <w:sz w:val="22"/>
-          <w:szCs w:val="22"/>
-        </w:rPr>
-        <w:instrText xml:space="preserve"> MERGEFIELD Tháng </w:instrText>
-      </w:r>
-      <w:r>
-        <w:rPr>
-          <w:sz w:val="22"/>
-          <w:szCs w:val="22"/>
-        </w:rPr>
-        <w:fldChar w:fldCharType="separate"/>
-      </w:r>
-      <w:r>
-        <w:rPr>
-          <w:sz w:val="22"/>
-          <w:szCs w:val="22"/>
-        </w:rPr>
-      </w:r>
-      <w:r>
-        <w:rPr>
-          <w:sz w:val="22"/>
-          <w:szCs w:val="22"/>
-        </w:rPr>
-        <w:fldChar w:fldCharType="end"/>
-      </w:r>
-      <w:r>
-        <w:rPr>
-          <w:sz w:val="22"/>
-          <w:szCs w:val="22"/>
-        </w:rPr>
-        <w:t xml:space="preserve"> năm </w:t>
-      </w:r>
-      <w:r>
-        <w:rPr>
-          <w:sz w:val="22"/>
-          <w:szCs w:val="22"/>
-        </w:rPr>
-        <w:fldChar w:fldCharType="begin"/>
-      </w:r>
-      <w:r>
-        <w:rPr>
-          <w:sz w:val="22"/>
-          <w:szCs w:val="22"/>
-        </w:rPr>
-        <w:instrText xml:space="preserve"> MERGEFIELD Năm </w:instrText>
-      </w:r>
-      <w:r>
-        <w:rPr>
-          <w:sz w:val="22"/>
-          <w:szCs w:val="22"/>
-        </w:rPr>
-        <w:fldChar w:fldCharType="separate"/>
-      </w:r>
-      <w:r>
-        <w:rPr>
-          <w:sz w:val="22"/>
-          <w:szCs w:val="22"/>
-        </w:rPr>
-      </w:r>
-      <w:r>
-        <w:rPr>
-          <w:sz w:val="22"/>
-          <w:szCs w:val="22"/>
-        </w:rPr>
-        <w:fldChar w:fldCharType="end"/>
-      </w:r>
-      <w:r>
-        <w:rPr>
-          <w:sz w:val="22"/>
-          <w:szCs w:val="22"/>
-        </w:rPr>
-        <w:t xml:space="preserve"> </w:t>
-      </w:r>
-      <w:r>
-        <w:rPr>
-          <w:sz w:val="22"/>
-          <w:szCs w:val="22"/>
-          <w:lang w:val="vi-VN"/>
-        </w:rPr>
-        <w:t xml:space="preserve"> tại Công ty cổ phần dinh dưỡng Hồng Hà, các bên có thông tin dưới đây gồm:</w:t>
+        <w:t>Hôm nay ${contract_signing_date_full} tại Công ty cổ phần dinh dưỡng Hồng Hà, các bên có thông tin dưới đây gồm:</w:t>
       </w:r>
     </w:p>
     <w:p>
@@ -3756,9 +3607,9 @@
       </w:r>
     </w:p>
     <w:sectPr>
-      <w:footerReference w:type="even" r:id="rId3"/>
-      <w:footerReference w:type="default" r:id="rId4"/>
-      <w:footerReference w:type="first" r:id="rId5"/>
+      <w:footerReference w:type="even" ns5:id="rId3"/>
+      <w:footerReference w:type="default" ns5:id="rId4"/>
+      <w:footerReference w:type="first" ns5:id="rId5"/>
       <w:type w:val="nextPage"/>
       <w:pgSz w:w="11906" w:h="16838"/>
       <w:pgMar w:left="1701" w:right="1134" w:gutter="0" w:header="0" w:top="1134" w:footer="624" w:bottom="1134"/>

</xml_diff>